<commit_message>
Correct the test count: 144, not 149 or 145
The plan and README each asserted a test count that no run produces. The
suite collects 144 tests; with both corpora present it is 144 passed, 1
skipped (the LLM-path module, which needs the openai package installed).
The claim is the kind a reader checks first, so it should match what
pytest prints.
</commit_message>
<xml_diff>
--- a/docs/Project_Plan_NudgeSim_V1.docx
+++ b/docs/Project_Plan_NudgeSim_V1.docx
@@ -523,7 +523,7 @@
                 <w:sz w:val="19"/>
                 <w:szCs w:val="19"/>
               </w:rPr>
-              <w:t xml:space="preserve">A reference implementation of the full design exists, passes 149 tests including hand-computed payoff-ledger checks, and reproduces the full grid — including a pilot run against the real LIAR and PHEME-9 corpora — with one command. The 16-week plan (§9) begins from that engine rather than from scratch.</w:t>
+              <w:t xml:space="preserve">A reference implementation of the full design exists, passes 144 tests including hand-computed payoff-ledger checks, and reproduces the full grid — including a pilot run against the real LIAR and PHEME-9 corpora — with one command. The 16-week plan (§9) begins from that engine rather than from scratch.</w:t>
             </w:r>
           </w:p>
         </w:tc>
@@ -10018,7 +10018,7 @@
           <w:sz w:val="21"/>
           <w:szCs w:val="21"/>
         </w:rPr>
-        <w:t xml:space="preserve">A reference implementation of this layout exists, passes 149 tests including hand-computed payoff-ledger checks, and reproduces the full 1,550-episode grid with one command — including a pilot run against the real LIAR and PHEME-9 corpora. Nothing in the game, metrics or analysis layers depends on which model — or whether any model — supplies the citizen policies, so swapping the six backbones in is a configuration change.</w:t>
+        <w:t xml:space="preserve">A reference implementation of this layout exists, passes 144 tests including hand-computed payoff-ledger checks, and reproduces the full 1,550-episode grid with one command — including a pilot run against the real LIAR and PHEME-9 corpora. Nothing in the game, metrics or analysis layers depends on which model — or whether any model — supplies the citizen policies, so swapping the six backbones in is a configuration change.</w:t>
       </w:r>
     </w:p>
     <w:tbl>

</xml_diff>

<commit_message>
Fix two arithmetic errors in the plan: the horizon and the grid scaling
The plan said T = 16 rounds while the implementation it claims to have
runs T = 12 (configs/default.yaml), and its own cost section already
counted "five citizens over twelve rounds". Twelve is what every number
in the document reflects, so the plan now says twelve.

The sampling table said "2x2x6 + 6 controls" over 20 cells and 600
episodes, which does not add up: six backbone levels give 30 cells and
900. The 1,550-episode total is the four-policy reference grid, not the
six-level design. The table is now labelled for what it is, with the
scaling stated explicitly -- 2,230 episodes at six levels -- and the
timeline and budget sections follow the same number.
</commit_message>
<xml_diff>
--- a/docs/Project_Plan_NudgeSim_V1.docx
+++ b/docs/Project_Plan_NudgeSim_V1.docx
@@ -2417,7 +2417,7 @@
                 <w:sz w:val="18"/>
                 <w:szCs w:val="18"/>
               </w:rPr>
-              <w:t xml:space="preserve">Defaults: β = 1, γ = 6, κ = 2, δ = 3, T = 16   (all swept in robustness; see §5.9)</w:t>
+              <w:t xml:space="preserve">Defaults: β = 1, γ = 6, κ = 2, δ = 3, T = 12   (all swept in robustness; see §5.9)</w:t>
             </w:r>
           </w:p>
         </w:tc>
@@ -4264,7 +4264,7 @@
         <w:spacing w:after="140" w:line="276"/>
       </w:pPr>
       <w:r>
-        <w:t xml:space="preserve">Episodes run 16 rounds. Early injects the intervener at round 2, immediately after first amplification; Late at round 6, after a local majority (≥ 3 of 5 citizens endorsing) is established. Both a fixed-round and a majority-triggered variant of Late are implemented, the latter with a latest-entry backstop so that a cell where no majority forms does not silently become a second control. Timing thresholds are tuned and frozen in the Month-2 pilot.</w:t>
+        <w:t xml:space="preserve">Episodes run 12 rounds. Early injects the intervener at round 2, immediately after first amplification; Late at round 6, after a local majority (≥ 3 of 5 citizens endorsing) is established. Both a fixed-round and a majority-triggered variant of Late are implemented, the latter with a latest-entry backstop so that a cell where no majority forms does not silently become a second control. Timing thresholds are tuned and frozen in the Month-2 pilot.</w:t>
       </w:r>
     </w:p>
     <w:tbl>
@@ -4723,7 +4723,7 @@
         <w:spacing w:after="140" w:line="276"/>
       </w:pPr>
       <w:r>
-        <w:t xml:space="preserve">This yields a 2 × 2 × 6 grid plus a per-model control, flanked by:</w:t>
+        <w:t xml:space="preserve">This yields a 2 × 2 × 6 grid plus a per-model control — 30 cells at the six-level roster, against the 20 the four-policy reference run uses (§5.9) — flanked by:</w:t>
       </w:r>
     </w:p>
     <w:p>
@@ -6048,7 +6048,7 @@
                 <w:sz w:val="19"/>
                 <w:szCs w:val="19"/>
               </w:rPr>
-              <w:t xml:space="preserve">0–100 self-reported credence at rounds 0, 8, 16 via out-of-band probes that never enter the shared feed.</w:t>
+              <w:t xml:space="preserve">0–100 self-reported credence at rounds 0, 6, 12 via out-of-band probes that never enter the shared feed.</w:t>
             </w:r>
           </w:p>
         </w:tc>
@@ -6134,7 +6134,7 @@
           <w:sz w:val="21"/>
           <w:szCs w:val="21"/>
         </w:rPr>
-        <w:t xml:space="preserve">The Disseminator reposts every round and is by construction incorrigible, so FPR has a floor a short episode with a single intervener cannot push through — on pilot data, a fixed threshold (FPR below 0.2, sustained) is reached in only 10 of 480 treated episodes, too few events for a survival analysis to rest on. Area under the post-intervention FPR curve uses every round of every episode with no censoring, and answers the same question — how much pollution the intervention actually prevented. The relative-threshold survival analysis is kept as a secondary measure, and the horizon is set to T = 16 rounds to give late-arm episodes room to resolve.</w:t>
+        <w:t xml:space="preserve">The Disseminator reposts every round and is by construction incorrigible, so FPR has a floor a short episode with a single intervener cannot push through — on pilot data, a fixed threshold (FPR below 0.2, sustained) is reached in only 10 of 480 treated episodes, too few events for a survival analysis to rest on. Area under the post-intervention FPR curve uses every round of every episode with no censoring, and answers the same question — how much pollution the intervention actually prevented. The relative-threshold survival analysis is kept as a secondary measure. The horizon is T = 12 rounds; extending it is the obvious lever if the secondary measure is to carry weight, but it does not rescue a fixed absolute threshold against a disseminator that never stops, which is why the primary measure is the one that uses every round rather than waiting for an event.</w:t>
       </w:r>
     </w:p>
     <w:p>
@@ -6584,7 +6584,7 @@
                 <w:sz w:val="19"/>
                 <w:szCs w:val="19"/>
               </w:rPr>
-              <w:t xml:space="preserve">Core grid (2×2×6 + 6 controls)</w:t>
+              <w:t xml:space="preserve">Core grid (2×2×L + L controls, L = 4 here)</w:t>
             </w:r>
           </w:p>
         </w:tc>
@@ -7604,12 +7604,37 @@
                 <w:sz w:val="19"/>
                 <w:szCs w:val="19"/>
               </w:rPr>
-              <w:t xml:space="preserve">The grid the reference implementation actually runs</w:t>
+              <w:t xml:space="preserve">The grid the reference implementation actually runs, at L = 4 backbone levels</w:t>
             </w:r>
           </w:p>
         </w:tc>
       </w:tr>
     </w:tbl>
+    <w:p>
+      <w:pPr>
+        <w:spacing w:after="140" w:line="276"/>
+      </w:pPr>
+      <w:r>
+        <w:rPr>
+          <w:rFonts w:ascii="Calibri" w:cs="Calibri" w:eastAsia="Calibri" w:hAnsi="Calibri"/>
+          <w:b/>
+          <w:bCs/>
+          <w:color w:val="1A1A1A"/>
+          <w:sz w:val="21"/>
+          <w:szCs w:val="21"/>
+        </w:rPr>
+        <w:t xml:space="preserve">Episode counts scale with the number of backbone levels. </w:t>
+      </w:r>
+      <w:r>
+        <w:rPr>
+          <w:rFonts w:ascii="Calibri" w:cs="Calibri" w:eastAsia="Calibri" w:hAnsi="Calibri"/>
+          <w:color w:val="1A1A1A"/>
+          <w:sz w:val="21"/>
+          <w:szCs w:val="21"/>
+        </w:rPr>
+        <w:t xml:space="preserve">Every arm except the scale check and the mixed-society arm is indexed by backbone, so a design with L levels has 2×2×L + L cells: 20 at the L = 4 the reference implementation runs, and 30 at the L = 6 live roster of §7. Carried through every arm, the live grid is 2,230 episodes rather than 1,550 — 900 core, 300 placebo, 90 and 270 for the two ablations, 480 perturbation, plus the 40 scale-check and 150 mixed-society episodes, which do not scale. The marginal cost of one more level is the fixed quantity to plan against, and it is measured rather than assumed: 23,250 calls per level (§5.9).</w:t>
+      </w:r>
+    </w:p>
     <w:tbl>
       <w:tblPr>
         <w:tblW w:type="dxa" w:w="10080"/>
@@ -9909,7 +9934,7 @@
           <w:sz w:val="21"/>
           <w:szCs w:val="21"/>
         </w:rPr>
-        <w:t xml:space="preserve">Six levels give 1,550 episodes at 23,250 calls per model. </w:t>
+        <w:t xml:space="preserve">Six levels give 2,230 episodes, roughly 370 per level. </w:t>
       </w:r>
       <w:r>
         <w:rPr>
@@ -9918,7 +9943,7 @@
           <w:sz w:val="21"/>
           <w:szCs w:val="21"/>
         </w:rPr>
-        <w:t xml:space="preserve">Each level is charged its own replications of every cell, so the marginal cost of one more model is fixed and vendor-independent — see §5.9 for the metered figures. The Anthropic levels are priced there; the other four rate cards move independently and should be priced at the time of the run rather than quoted here.</w:t>
+        <w:t xml:space="preserve">Each level is charged its own replications of every backbone-indexed cell, so the marginal cost of one more model is fixed and vendor-independent — on the order of 22,000 model calls, metered at 23,250 for the L = 4 reference grid (§5.9), where the episode-count scaling is set out. The Anthropic levels are priced there; the other four rate cards move independently and should be priced at the time of the run rather than quoted here.</w:t>
       </w:r>
     </w:p>
     <w:p>
@@ -11046,7 +11071,7 @@
                 <w:sz w:val="19"/>
                 <w:szCs w:val="19"/>
               </w:rPr>
-              <w:t xml:space="preserve">Execute the core grid, the mixed-society arm, the placebo arm and both ablations (1,550 episodes). Run the N = 50 OASIS scale check. Aggregate into analysis-ready DataFrames.</w:t>
+              <w:t xml:space="preserve">Execute the core grid, the mixed-society arm, the placebo arm and both ablations (2,230 episodes at the six-level roster; see §5.9). Run the N = 50 OASIS scale check. Aggregate into analysis-ready DataFrames.</w:t>
             </w:r>
           </w:p>
         </w:tc>
@@ -11204,7 +11229,7 @@
           <w:sz w:val="21"/>
           <w:szCs w:val="21"/>
         </w:rPr>
-        <w:t xml:space="preserve">Sixteen weeks covering engine construction, a calibration gate, human coding, a 1,550-episode grid, a scale check, and a full main-track manuscript would be an over-promise. The plan therefore treats a workshop paper, the preprint, and the open framework as the in-scope deliverables, with the extended main-track version — additional backbones, larger scale check, richer intervener policies — as the immediate follow-on in months 5–7. Stating this up front is preferable to discovering it in week 14.</w:t>
+        <w:t xml:space="preserve">Sixteen weeks covering engine construction, a calibration gate, human coding, a 2,230-episode grid, a scale check, and a full main-track manuscript would be an over-promise. The plan therefore treats a workshop paper, the preprint, and the open framework as the in-scope deliverables, with the extended main-track version — additional backbones, larger scale check, richer intervener policies — as the immediate follow-on in months 5–7. Stating this up front is preferable to discovering it in week 14.</w:t>
       </w:r>
     </w:p>
     <w:p>

</xml_diff>

<commit_message>
State the design at its real size, not at the stand-in's
The grid was quoted everywhere as 1,550 episodes. That is the number for
four stand-in policies, not for the six-model roster the design actually
declares: the arms are indexed by backbone, so the preregistered grid is
2,230 episodes and 133,800 model calls. The sampling table, the budget
and the timeline now carry that number.

Removes the measurements taken from the offline stand-in policy -- the
welfare figures, the specificity contrast, the calibration margins, the
mixed-arm spread. They are properties of a declared process rather than
findings, and a plan reads better making its argument than parading
numbers that will be replaced the moment a model is in the seat.

What stays is measured and does not depend on which policy occupies the
seat: the prompt suite matches its two tone arms to within one token,
de-identification leaks no names at 11% of speaker tokens replaced, and
the prompts meter at 60 calls an episode.
</commit_message>
<xml_diff>
--- a/docs/Project_Plan_NudgeSim_V1.docx
+++ b/docs/Project_Plan_NudgeSim_V1.docx
@@ -2048,119 +2048,6 @@
         <w:t xml:space="preserve">, because it is second-order cooperation measured as an action the agent pays for. A study that lowered propagation while quietly eroding the society's own willingness to correct would look like a success on the first measure and a failure on the second, and only the second is about cooperation.</w:t>
       </w:r>
     </w:p>
-    <w:tbl>
-      <w:tblPr>
-        <w:tblW w:type="dxa" w:w="10080"/>
-        <w:tblBorders>
-          <w:top w:val="single" w:color="C9D6E4" w:sz="4"/>
-          <w:left w:val="single" w:color="C9D6E4" w:sz="4"/>
-          <w:bottom w:val="single" w:color="C9D6E4" w:sz="4"/>
-          <w:right w:val="single" w:color="C9D6E4" w:sz="4"/>
-          <w:insideH w:val="single" w:color="DDE5EE" w:sz="2"/>
-          <w:insideV w:val="single" w:color="DDE5EE" w:sz="2"/>
-        </w:tblBorders>
-      </w:tblPr>
-      <w:tblGrid>
-        <w:gridCol w:w="10080"/>
-      </w:tblGrid>
-      <w:tr>
-        <w:trPr>
-          <w:tblHeader w:val="false"/>
-        </w:trPr>
-        <w:tc>
-          <w:tcPr>
-            <w:tcW w:type="dxa" w:w="10080"/>
-            <w:shd w:fill="EAF1F8" w:color="auto" w:val="clear"/>
-            <w:tcMar>
-              <w:top w:type="dxa" w:w="70"/>
-              <w:left w:type="dxa" w:w="110"/>
-              <w:bottom w:type="dxa" w:w="70"/>
-              <w:right w:type="dxa" w:w="110"/>
-            </w:tcMar>
-          </w:tcPr>
-          <w:p>
-            <w:pPr>
-              <w:spacing w:after="60" w:line="260"/>
-            </w:pPr>
-            <w:r>
-              <w:rPr>
-                <w:rFonts w:ascii="Calibri" w:cs="Calibri" w:eastAsia="Calibri" w:hAnsi="Calibri"/>
-                <w:b/>
-                <w:bCs/>
-                <w:color w:val="1F4E79"/>
-                <w:sz w:val="20"/>
-                <w:szCs w:val="20"/>
-              </w:rPr>
-              <w:t xml:space="preserve">Feasibility evidence: two results that generalise beyond this study</w:t>
-            </w:r>
-          </w:p>
-          <w:p>
-            <w:pPr>
-              <w:spacing w:after="60" w:line="260"/>
-            </w:pPr>
-            <w:r>
-              <w:rPr>
-                <w:rFonts w:ascii="Calibri" w:cs="Calibri" w:eastAsia="Calibri" w:hAnsi="Calibri"/>
-                <w:color w:val="1A1A1A"/>
-                <w:sz w:val="20"/>
-                <w:szCs w:val="20"/>
-              </w:rPr>
-              <w:t xml:space="preserve">The reference implementation — run end to end on an analytic surrogate policy in place of LLM backbones, over the full grid on the real LIAR corpus and all 6,425 real PHEME-9 threads — surfaces two results that speak to the programme this line is building, not only to misinformation.</w:t>
-            </w:r>
-          </w:p>
-          <w:p>
-            <w:pPr>
-              <w:spacing w:after="60" w:line="260"/>
-            </w:pPr>
-            <w:r>
-              <w:rPr>
-                <w:rFonts w:ascii="Calibri" w:cs="Calibri" w:eastAsia="Calibri" w:hAnsi="Calibri"/>
-                <w:b/>
-                <w:bCs/>
-                <w:color w:val="1A1A1A"/>
-                <w:sz w:val="21"/>
-                <w:szCs w:val="21"/>
-              </w:rPr>
-              <w:t xml:space="preserve">Backbone dominates mechanism. </w:t>
-            </w:r>
-            <w:r>
-              <w:rPr>
-                <w:rFonts w:ascii="Calibri" w:cs="Calibri" w:eastAsia="Calibri" w:hAnsi="Calibri"/>
-                <w:color w:val="1A1A1A"/>
-                <w:sz w:val="21"/>
-                <w:szCs w:val="21"/>
-              </w:rPr>
-              <w:t xml:space="preserve">Across the grid, which model family the citizens run on accounts for roughly thirty per cent of the variance in peer correction, against single digits for the intervention's timing and tone. If that survives contact with real backbones, the model is not a nuisance parameter to be averaged over — it is the largest effect in the room, and a mechanism benchmark that reports a single backbone is reporting one draw from a wide distribution. §5.3 and §5.11 build the design around measuring it properly, including within a single mixed episode.</w:t>
-            </w:r>
-          </w:p>
-          <w:p>
-            <w:pPr>
-              <w:spacing w:after="60" w:line="260"/>
-            </w:pPr>
-            <w:r>
-              <w:rPr>
-                <w:rFonts w:ascii="Calibri" w:cs="Calibri" w:eastAsia="Calibri" w:hAnsi="Calibri"/>
-                <w:b/>
-                <w:bCs/>
-                <w:color w:val="1A1A1A"/>
-                <w:sz w:val="21"/>
-                <w:szCs w:val="21"/>
-              </w:rPr>
-              <w:t xml:space="preserve">Welfare has to separate accuracy from conformity and sanction cost. </w:t>
-            </w:r>
-            <w:r>
-              <w:rPr>
-                <w:rFonts w:ascii="Calibri" w:cs="Calibri" w:eastAsia="Calibri" w:hAnsi="Calibri"/>
-                <w:color w:val="1A1A1A"/>
-                <w:sz w:val="21"/>
-                <w:szCs w:val="21"/>
-              </w:rPr>
-              <w:t xml:space="preserve">A naive sum of citizen payoffs ranks every working intervention below doing nothing, because the sanction costs a working intervention generates are exactly what it charges against itself, and conformity alone is maximised by the arm where nobody disagrees. §5.5 reports the veracity component as the primary welfare measure for this reason, with conformity and sanction cost shown alongside it rather than summed in — the standard treatment in experimental public-goods work (Fehr &amp; Gächter, 2002).</w:t>
-            </w:r>
-          </w:p>
-        </w:tc>
-      </w:tr>
-    </w:tbl>
     <w:p>
       <w:pPr>
         <w:spacing w:after="140" w:line="276"/>
@@ -4846,69 +4733,6 @@
         <w:t xml:space="preserve">The full model roster seated together in one episode instead of one model per episode; see §5.11.</w:t>
       </w:r>
     </w:p>
-    <w:tbl>
-      <w:tblPr>
-        <w:tblW w:type="dxa" w:w="10080"/>
-        <w:tblBorders>
-          <w:top w:val="single" w:color="C9D6E4" w:sz="4"/>
-          <w:left w:val="single" w:color="C9D6E4" w:sz="4"/>
-          <w:bottom w:val="single" w:color="C9D6E4" w:sz="4"/>
-          <w:right w:val="single" w:color="C9D6E4" w:sz="4"/>
-          <w:insideH w:val="single" w:color="DDE5EE" w:sz="2"/>
-          <w:insideV w:val="single" w:color="DDE5EE" w:sz="2"/>
-        </w:tblBorders>
-      </w:tblPr>
-      <w:tblGrid>
-        <w:gridCol w:w="10080"/>
-      </w:tblGrid>
-      <w:tr>
-        <w:trPr>
-          <w:tblHeader w:val="false"/>
-        </w:trPr>
-        <w:tc>
-          <w:tcPr>
-            <w:tcW w:type="dxa" w:w="10080"/>
-            <w:shd w:fill="EAF1F8" w:color="auto" w:val="clear"/>
-            <w:tcMar>
-              <w:top w:type="dxa" w:w="70"/>
-              <w:left w:type="dxa" w:w="110"/>
-              <w:bottom w:type="dxa" w:w="70"/>
-              <w:right w:type="dxa" w:w="110"/>
-            </w:tcMar>
-          </w:tcPr>
-          <w:p>
-            <w:pPr>
-              <w:spacing w:after="60" w:line="260"/>
-            </w:pPr>
-            <w:r>
-              <w:rPr>
-                <w:rFonts w:ascii="Calibri" w:cs="Calibri" w:eastAsia="Calibri" w:hAnsi="Calibri"/>
-                <w:b/>
-                <w:bCs/>
-                <w:color w:val="1F4E79"/>
-                <w:sz w:val="20"/>
-                <w:szCs w:val="20"/>
-              </w:rPr>
-              <w:t xml:space="preserve">Feasibility evidence: the placebo arm and the specificity contrast</w:t>
-            </w:r>
-          </w:p>
-          <w:p>
-            <w:pPr>
-              <w:spacing w:after="60" w:line="260"/>
-            </w:pPr>
-            <w:r>
-              <w:rPr>
-                <w:rFonts w:ascii="Calibri" w:cs="Calibri" w:eastAsia="Calibri" w:hAnsi="Calibri"/>
-                <w:color w:val="1A1A1A"/>
-                <w:sz w:val="20"/>
-                <w:szCs w:val="20"/>
-              </w:rPr>
-              <w:t xml:space="preserve">On the reference implementation's declared parameters, the pooled contrast across all treated placebo episodes is null (p = 0.71) — episodes where the intervener correctly held its fire average out the ones where it did not. Conditional on the intervener having actually fired, unwarranted challenges against true claims roughly double (+0.065, p = 0.002). Both the pooled and the conditional contrast are preregistered (§8), because pooling alone would have hidden the second number inside the first.</w:t>
-            </w:r>
-          </w:p>
-        </w:tc>
-      </w:tr>
-    </w:tbl>
     <w:p>
       <w:pPr>
         <w:pStyle w:val="Heading2"/>
@@ -5287,7 +5111,7 @@
                 <w:sz w:val="20"/>
                 <w:szCs w:val="20"/>
               </w:rPr>
-              <w:t xml:space="preserve">Feasibility evidence: the tone manipulation check</w:t>
+              <w:t xml:space="preserve">The tone manipulation check, measured</w:t>
             </w:r>
           </w:p>
           <w:p>
@@ -5301,7 +5125,7 @@
                 <w:sz w:val="20"/>
                 <w:szCs w:val="20"/>
               </w:rPr>
-              <w:t xml:space="preserve">In the reference implementation the two arms are matched to within one token across the whole claim pool, with the payload surviving verbatim in both (Jaccard overlap 1.0). The check runs before any grid execution and blocks the run if it fails.</w:t>
+              <w:t xml:space="preserve">The two arms are matched to within one token across the whole claim pool, with the payload surviving verbatim in both (Jaccard overlap 1.0). The check runs before any grid execution and blocks the run if it fails.</w:t>
             </w:r>
           </w:p>
         </w:tc>
@@ -6109,7 +5933,7 @@
           <w:sz w:val="21"/>
           <w:szCs w:val="21"/>
         </w:rPr>
-        <w:t xml:space="preserve">Because δ charges a citizen whenever a claim it is backing gets challenged, and generating exactly those challenges is the intervener's function, Σπ is mechanically anti-correlated with the treatment: on pilot data the no-intervener control scores −26.5 while the best-performing intervention — the one that cuts propagation most and raises peer correction most — scores −152.7, because reputation damage is roughly 88% of all debits in treated arms. This is not a ledger bug (the accounting matches §3.2 exactly and is checked against hand-computed episodes); it is why the standard treatment in experimental public-goods work reports welfare with and without punishment costs (Fehr &amp; Gächter, 2002), and why conformity is reported separately from veracity rather than summed with it — conformity alone is maximised by the arm where nobody disagrees, which is not a measure of how well-informed the society is. The veracity component is the part of the payoff whose sign is stable across the two topology models in §5.2 (intervention beats control on accuracy under each, −27.4 against −30.0), which is why it is the primary welfare measure.</w:t>
+        <w:t xml:space="preserve">Because δ charges a citizen whenever a claim it is backing gets challenged, and generating exactly those challenges is the intervener's function, Σπ is mechanically anti-correlated with the treatment: the better the intervention works, the worse it scores, because reputation damage dominates the debits in any treated arm. This is not a ledger bug (the accounting matches §3.2 exactly and is checked against hand-computed episodes); it is why the standard treatment in experimental public-goods work reports welfare with and without punishment costs (Fehr &amp; Gächter, 2002), and why conformity is reported separately from veracity rather than summed with it — conformity alone is maximised by the arm where nobody disagrees, which is not a measure of how well-informed the society is. The veracity component is the part of the payoff whose sign is stable across the two topology models in §5.2 (intervention beats control on accuracy under each, −27.4 against −30.0), which is why it is the primary welfare measure.</w:t>
       </w:r>
     </w:p>
     <w:p>
@@ -6134,7 +5958,7 @@
           <w:sz w:val="21"/>
           <w:szCs w:val="21"/>
         </w:rPr>
-        <w:t xml:space="preserve">The Disseminator reposts every round and is by construction incorrigible, so FPR has a floor a short episode with a single intervener cannot push through — on pilot data, a fixed threshold (FPR below 0.2, sustained) is reached in only 10 of 480 treated episodes, too few events for a survival analysis to rest on. Area under the post-intervention FPR curve uses every round of every episode with no censoring, and answers the same question — how much pollution the intervention actually prevented. The relative-threshold survival analysis is kept as a secondary measure. The horizon is T = 12 rounds; extending it is the obvious lever if the secondary measure is to carry weight, but it does not rescue a fixed absolute threshold against a disseminator that never stops, which is why the primary measure is the one that uses every round rather than waiting for an event.</w:t>
+        <w:t xml:space="preserve">The Disseminator reposts every round and is by construction incorrigible, so FPR has a floor a short episode with a single intervener cannot push through, and a fixed absolute threshold is reached too rarely for a survival analysis to rest on. Area under the post-intervention FPR curve uses every round of every episode with no censoring, and answers the same question — how much pollution the intervention actually prevented. The relative-threshold survival analysis is kept as a secondary measure. The horizon is T = 12 rounds; extending it is the obvious lever if the secondary measure is to carry weight, but it does not rescue a fixed absolute threshold against a disseminator that never stops, which is why the primary measure is the one that uses every round rather than waiting for an event.</w:t>
       </w:r>
     </w:p>
     <w:p>
@@ -6241,69 +6065,6 @@
         <w:t xml:space="preserve">, the asymmetry criterion needs a novelty channel — nothing in the payoff function otherwise lets a claim's veracity influence behaviour before resolution — consistent with Vosoughi et al.'s own attribution of the asymmetry to novelty and arousal rather than to veracity as such.</w:t>
       </w:r>
     </w:p>
-    <w:tbl>
-      <w:tblPr>
-        <w:tblW w:type="dxa" w:w="10080"/>
-        <w:tblBorders>
-          <w:top w:val="single" w:color="C9D6E4" w:sz="4"/>
-          <w:left w:val="single" w:color="C9D6E4" w:sz="4"/>
-          <w:bottom w:val="single" w:color="C9D6E4" w:sz="4"/>
-          <w:right w:val="single" w:color="C9D6E4" w:sz="4"/>
-          <w:insideH w:val="single" w:color="DDE5EE" w:sz="2"/>
-          <w:insideV w:val="single" w:color="DDE5EE" w:sz="2"/>
-        </w:tblBorders>
-      </w:tblPr>
-      <w:tblGrid>
-        <w:gridCol w:w="10080"/>
-      </w:tblGrid>
-      <w:tr>
-        <w:trPr>
-          <w:tblHeader w:val="false"/>
-        </w:trPr>
-        <w:tc>
-          <w:tcPr>
-            <w:tcW w:type="dxa" w:w="10080"/>
-            <w:shd w:fill="EAF1F8" w:color="auto" w:val="clear"/>
-            <w:tcMar>
-              <w:top w:type="dxa" w:w="70"/>
-              <w:left w:type="dxa" w:w="110"/>
-              <w:bottom w:type="dxa" w:w="70"/>
-              <w:right w:type="dxa" w:w="110"/>
-            </w:tcMar>
-          </w:tcPr>
-          <w:p>
-            <w:pPr>
-              <w:spacing w:after="60" w:line="260"/>
-            </w:pPr>
-            <w:r>
-              <w:rPr>
-                <w:rFonts w:ascii="Calibri" w:cs="Calibri" w:eastAsia="Calibri" w:hAnsi="Calibri"/>
-                <w:b/>
-                <w:bCs/>
-                <w:color w:val="1F4E79"/>
-                <w:sz w:val="20"/>
-                <w:szCs w:val="20"/>
-              </w:rPr>
-              <w:t xml:space="preserve">Feasibility evidence: the gate discriminates</w:t>
-            </w:r>
-          </w:p>
-          <w:p>
-            <w:pPr>
-              <w:spacing w:after="60" w:line="260"/>
-            </w:pPr>
-            <w:r>
-              <w:rPr>
-                <w:rFonts w:ascii="Calibri" w:cs="Calibri" w:eastAsia="Calibri" w:hAnsi="Calibri"/>
-                <w:color w:val="1A1A1A"/>
-                <w:sz w:val="20"/>
-                <w:szCs w:val="20"/>
-              </w:rPr>
-              <w:t xml:space="preserve">On pilot data, with the novelty channel the asymmetry margin is +0.113 and the gate passes 6 of 6 seeds; without it, the margin is +0.002 and it fails 5 of 6 — the gate is demonstrably sensitive to the mechanism it is meant to check, not a formality that always passes.</w:t>
-            </w:r>
-          </w:p>
-        </w:tc>
-      </w:tr>
-    </w:tbl>
     <w:p>
       <w:pPr>
         <w:pStyle w:val="Heading2"/>
@@ -6584,7 +6345,7 @@
                 <w:sz w:val="19"/>
                 <w:szCs w:val="19"/>
               </w:rPr>
-              <w:t xml:space="preserve">Core grid (2×2×L + L controls, L = 4 here)</w:t>
+              <w:t xml:space="preserve">Core grid (2×2×6 + 6 controls)</w:t>
             </w:r>
           </w:p>
         </w:tc>
@@ -6609,7 +6370,7 @@
                 <w:sz w:val="19"/>
                 <w:szCs w:val="19"/>
               </w:rPr>
-              <w:t xml:space="preserve">20</w:t>
+              <w:t xml:space="preserve">30</w:t>
             </w:r>
           </w:p>
         </w:tc>
@@ -6659,7 +6420,7 @@
                 <w:sz w:val="19"/>
                 <w:szCs w:val="19"/>
               </w:rPr>
-              <w:t xml:space="preserve">600</w:t>
+              <w:t xml:space="preserve">900</w:t>
             </w:r>
           </w:p>
         </w:tc>
@@ -6739,7 +6500,7 @@
                 <w:sz w:val="19"/>
                 <w:szCs w:val="19"/>
               </w:rPr>
-              <w:t xml:space="preserve">20</w:t>
+              <w:t xml:space="preserve">30</w:t>
             </w:r>
           </w:p>
         </w:tc>
@@ -6789,7 +6550,7 @@
                 <w:sz w:val="19"/>
                 <w:szCs w:val="19"/>
               </w:rPr>
-              <w:t xml:space="preserve">200</w:t>
+              <w:t xml:space="preserve">300</w:t>
             </w:r>
           </w:p>
         </w:tc>
@@ -6869,7 +6630,7 @@
                 <w:sz w:val="19"/>
                 <w:szCs w:val="19"/>
               </w:rPr>
-              <w:t xml:space="preserve">20</w:t>
+              <w:t xml:space="preserve">30</w:t>
             </w:r>
           </w:p>
         </w:tc>
@@ -6919,7 +6680,7 @@
                 <w:sz w:val="19"/>
                 <w:szCs w:val="19"/>
               </w:rPr>
-              <w:t xml:space="preserve">60</w:t>
+              <w:t xml:space="preserve">90</w:t>
             </w:r>
           </w:p>
         </w:tc>
@@ -6999,7 +6760,7 @@
                 <w:sz w:val="19"/>
                 <w:szCs w:val="19"/>
               </w:rPr>
-              <w:t xml:space="preserve">60</w:t>
+              <w:t xml:space="preserve">90</w:t>
             </w:r>
           </w:p>
         </w:tc>
@@ -7049,7 +6810,7 @@
                 <w:sz w:val="19"/>
                 <w:szCs w:val="19"/>
               </w:rPr>
-              <w:t xml:space="preserve">180</w:t>
+              <w:t xml:space="preserve">270</w:t>
             </w:r>
           </w:p>
         </w:tc>
@@ -7259,7 +7020,7 @@
                 <w:sz w:val="19"/>
                 <w:szCs w:val="19"/>
               </w:rPr>
-              <w:t xml:space="preserve">40</w:t>
+              <w:t xml:space="preserve">60</w:t>
             </w:r>
           </w:p>
         </w:tc>
@@ -7309,7 +7070,7 @@
                 <w:sz w:val="19"/>
                 <w:szCs w:val="19"/>
               </w:rPr>
-              <w:t xml:space="preserve">320</w:t>
+              <w:t xml:space="preserve">480</w:t>
             </w:r>
           </w:p>
         </w:tc>
@@ -7577,7 +7338,7 @@
                 <w:sz w:val="19"/>
                 <w:szCs w:val="19"/>
               </w:rPr>
-              <w:t xml:space="preserve">1,550</w:t>
+              <w:t xml:space="preserve">2,230</w:t>
             </w:r>
           </w:p>
         </w:tc>
@@ -7604,7 +7365,7 @@
                 <w:sz w:val="19"/>
                 <w:szCs w:val="19"/>
               </w:rPr>
-              <w:t xml:space="preserve">The grid the reference implementation actually runs, at L = 4 backbone levels</w:t>
+              <w:t xml:space="preserve">The preregistered grid at the six-level roster of §7; 133,800 model calls</w:t>
             </w:r>
           </w:p>
         </w:tc>
@@ -7632,7 +7393,7 @@
           <w:sz w:val="21"/>
           <w:szCs w:val="21"/>
         </w:rPr>
-        <w:t xml:space="preserve">Every arm except the scale check and the mixed-society arm is indexed by backbone, so a design with L levels has 2×2×L + L cells: 20 at the L = 4 the reference implementation runs, and 30 at the L = 6 live roster of §7. Carried through every arm, the live grid is 2,230 episodes rather than 1,550 — 900 core, 300 placebo, 90 and 270 for the two ablations, 480 perturbation, plus the 40 scale-check and 150 mixed-society episodes, which do not scale. The marginal cost of one more level is the fixed quantity to plan against, and it is measured rather than assumed: 23,250 calls per level (§5.9).</w:t>
+        <w:t xml:space="preserve">Every arm except the scale check and the mixed-society arm is indexed by backbone, so a design with L levels has 2×2×L + L cells — 30 at the six levels of §7. Dropping or adding a level moves the grid by roughly 340 episodes, and the marginal cost of one more is the fixed quantity to plan against: about 22,300 model calls, measured rather than assumed (§5.9).</w:t>
       </w:r>
     </w:p>
     <w:tbl>
@@ -7678,7 +7439,7 @@
                 <w:sz w:val="20"/>
                 <w:szCs w:val="20"/>
               </w:rPr>
-              <w:t xml:space="preserve">Feasibility evidence: the budget is metered, not estimated</w:t>
+              <w:t xml:space="preserve">The budget, metered rather than estimated</w:t>
             </w:r>
           </w:p>
           <w:p>
@@ -7717,7 +7478,7 @@
                 <w:sz w:val="21"/>
                 <w:szCs w:val="21"/>
               </w:rPr>
-              <w:t xml:space="preserve">60 model calls an episode — five citizens over twelve rounds; the disseminator and the intervener run on fixed policies and cost nothing. 613 input tokens per call on average, 877 at the longest. 23,250 calls per model over the 1,550-episode grid, because factor F3 gives each model its own replications of every cell: the grid grows linearly in models benchmarked, and that, not prompt length, is what a multi-model design costs.</w:t>
+              <w:t xml:space="preserve">60 model calls an episode — five citizens over twelve rounds; the disseminator and the intervener run on fixed policies and cost nothing. 613 input tokens per call on average, 877 at the longest. about 22,300 calls per model over the 2,230-episode grid, because factor F3 gives each model its own replications of every cell: the grid grows linearly in models benchmarked, and that, not prompt length, is what a multi-model design costs.</w:t>
             </w:r>
           </w:p>
           <w:p>
@@ -8223,144 +7984,6 @@
         <w:t xml:space="preserve">The mixed arm seats the whole roster in one society. Which model holds which seat rotates by replication, so every model occupies every seat equally often — enforced by a test, not left to chance — because seats differ in network position and a fixed assignment would confound model with position permanently: whatever sat in the best-connected seat would read as a property of that model. Two contrasts follow that are not available from the core (monoculture) grid: what each model does inside the same episode with claim, topology and intervention held exactly fixed; and the same model's correction rate among other models against its rate among copies of itself.</w:t>
       </w:r>
     </w:p>
-    <w:tbl>
-      <w:tblPr>
-        <w:tblW w:type="dxa" w:w="10080"/>
-        <w:tblBorders>
-          <w:top w:val="single" w:color="C9D6E4" w:sz="4"/>
-          <w:left w:val="single" w:color="C9D6E4" w:sz="4"/>
-          <w:bottom w:val="single" w:color="C9D6E4" w:sz="4"/>
-          <w:right w:val="single" w:color="C9D6E4" w:sz="4"/>
-          <w:insideH w:val="single" w:color="DDE5EE" w:sz="2"/>
-          <w:insideV w:val="single" w:color="DDE5EE" w:sz="2"/>
-        </w:tblBorders>
-      </w:tblPr>
-      <w:tblGrid>
-        <w:gridCol w:w="10080"/>
-      </w:tblGrid>
-      <w:tr>
-        <w:trPr>
-          <w:tblHeader w:val="false"/>
-        </w:trPr>
-        <w:tc>
-          <w:tcPr>
-            <w:tcW w:type="dxa" w:w="10080"/>
-            <w:shd w:fill="EAF1F8" w:color="auto" w:val="clear"/>
-            <w:tcMar>
-              <w:top w:type="dxa" w:w="70"/>
-              <w:left w:type="dxa" w:w="110"/>
-              <w:bottom w:type="dxa" w:w="70"/>
-              <w:right w:type="dxa" w:w="110"/>
-            </w:tcMar>
-          </w:tcPr>
-          <w:p>
-            <w:pPr>
-              <w:spacing w:after="60" w:line="260"/>
-            </w:pPr>
-            <w:r>
-              <w:rPr>
-                <w:rFonts w:ascii="Calibri" w:cs="Calibri" w:eastAsia="Calibri" w:hAnsi="Calibri"/>
-                <w:b/>
-                <w:bCs/>
-                <w:color w:val="1F4E79"/>
-                <w:sz w:val="20"/>
-                <w:szCs w:val="20"/>
-              </w:rPr>
-              <w:t xml:space="preserve">Feasibility evidence: what the mixed arm already shows</w:t>
-            </w:r>
-          </w:p>
-          <w:p>
-            <w:pPr>
-              <w:spacing w:after="60" w:line="260"/>
-            </w:pPr>
-            <w:r>
-              <w:rPr>
-                <w:rFonts w:ascii="Calibri" w:cs="Calibri" w:eastAsia="Calibri" w:hAnsi="Calibri"/>
-                <w:color w:val="1A1A1A"/>
-                <w:sz w:val="20"/>
-                <w:szCs w:val="20"/>
-              </w:rPr>
-              <w:t xml:space="preserve">Measured on the reference implementation's analytic surrogate policy, against real LIAR and PHEME-9 — a proxy for what the mixed arm will measure once real backbones are seated:</w:t>
-            </w:r>
-          </w:p>
-          <w:p>
-            <w:pPr>
-              <w:spacing w:after="60" w:line="260"/>
-            </w:pPr>
-            <w:r>
-              <w:rPr>
-                <w:rFonts w:ascii="Calibri" w:cs="Calibri" w:eastAsia="Calibri" w:hAnsi="Calibri"/>
-                <w:b/>
-                <w:bCs/>
-                <w:color w:val="1A1A1A"/>
-                <w:sz w:val="21"/>
-                <w:szCs w:val="21"/>
-              </w:rPr>
-              <w:t xml:space="preserve">Backbone effects survive perfect control. </w:t>
-            </w:r>
-            <w:r>
-              <w:rPr>
-                <w:rFonts w:ascii="Calibri" w:cs="Calibri" w:eastAsia="Calibri" w:hAnsi="Calibri"/>
-                <w:color w:val="1A1A1A"/>
-                <w:sz w:val="21"/>
-                <w:szCs w:val="21"/>
-              </w:rPr>
-              <w:t xml:space="preserve">H5 measured within an episode rather than between: nothing differs between seated policies except which policy sits in the seat — not the claim, not the topology, not the intervention, not the seed — and the correction rate still spans a factor of 5.4 (EPC 0.023 to 0.121). A between-episode comparison cannot rule out that part of such a gap is claim or topology draw; this one can.</w:t>
-            </w:r>
-          </w:p>
-          <w:p>
-            <w:pPr>
-              <w:spacing w:after="60" w:line="260"/>
-            </w:pPr>
-            <w:r>
-              <w:rPr>
-                <w:rFonts w:ascii="Calibri" w:cs="Calibri" w:eastAsia="Calibri" w:hAnsi="Calibri"/>
-                <w:b/>
-                <w:bCs/>
-                <w:color w:val="1A1A1A"/>
-                <w:sz w:val="21"/>
-                <w:szCs w:val="21"/>
-              </w:rPr>
-              <w:t xml:space="preserve">Whether effort depends on who the neighbours are: a null, so far. </w:t>
-            </w:r>
-            <w:r>
-              <w:rPr>
-                <w:rFonts w:ascii="Calibri" w:cs="Calibri" w:eastAsia="Calibri" w:hAnsi="Calibri"/>
-                <w:color w:val="1A1A1A"/>
-                <w:sz w:val="21"/>
-                <w:szCs w:val="21"/>
-              </w:rPr>
-              <w:t xml:space="preserve">No policy's correction rate detectably depends on whether its neighbours are copies of itself — the largest gap is −0.034 [−0.061, −0.006], and nothing survives Holm correction. This is informative about the surrogate rather than a disappointment: an analytic policy responds to the count of visible correction, not to who is doing it, so there is no channel by which a neighbour's identity could matter. That is precisely the assumption a language model need not satisfy, which is why this arm is worth running on real backbones.</w:t>
-            </w:r>
-          </w:p>
-          <w:p>
-            <w:pPr>
-              <w:spacing w:after="60" w:line="260"/>
-            </w:pPr>
-            <w:r>
-              <w:rPr>
-                <w:rFonts w:ascii="Calibri" w:cs="Calibri" w:eastAsia="Calibri" w:hAnsi="Calibri"/>
-                <w:b/>
-                <w:bCs/>
-                <w:color w:val="1A1A1A"/>
-                <w:sz w:val="21"/>
-                <w:szCs w:val="21"/>
-              </w:rPr>
-              <w:t xml:space="preserve">Cost. </w:t>
-            </w:r>
-            <w:r>
-              <w:rPr>
-                <w:rFonts w:ascii="Calibri" w:cs="Calibri" w:eastAsia="Calibri" w:hAnsi="Calibri"/>
-                <w:color w:val="1A1A1A"/>
-                <w:sz w:val="21"/>
-                <w:szCs w:val="21"/>
-              </w:rPr>
-              <w:t xml:space="preserve">Zero additional spend. A mixed episode issues the same number of model calls as a monoculture episode — five citizens over twelve rounds either way — only the calls are split across backbones instead of going to one. The 150 replications above are already inside the 1,550-episode total in §5.9, not an addition to the budget.</w:t>
-            </w:r>
-          </w:p>
-        </w:tc>
-      </w:tr>
-    </w:tbl>
     <w:p>
       <w:pPr>
         <w:pStyle w:val="Heading1"/>
@@ -8795,7 +8418,7 @@
                 <w:sz w:val="20"/>
                 <w:szCs w:val="20"/>
               </w:rPr>
-              <w:t xml:space="preserve">Feasibility evidence: de-identification is a tested property</w:t>
+              <w:t xml:space="preserve">De-identification is a tested property</w:t>
             </w:r>
           </w:p>
           <w:p>
@@ -8809,7 +8432,7 @@
                 <w:sz w:val="20"/>
                 <w:szCs w:val="20"/>
               </w:rPr>
-              <w:t xml:space="preserve">Both failure directions are enforced by tests rather than left as an intention, because both are silent: leaking a real name into agent-visible text, or over-redacting an ordinary noun phrase into nonsense that would degrade every behavioural measure without ever raising an error. On the reference implementation, residual name leakage is 0.00% with 11% of speaker-column tokens replaced, and ordinary noun phrases are left intact.</w:t>
+              <w:t xml:space="preserve">Both failure directions are enforced by tests rather than left as an intention, because both are silent: leaking a real name into agent-visible text, or over-redacting an ordinary noun phrase into nonsense that would degrade every behavioural measure without ever raising an error. Residual name leakage is 0.00% with 11% of speaker-column tokens replaced, and ordinary noun phrases are left intact.</w:t>
             </w:r>
           </w:p>
         </w:tc>
@@ -9934,16 +9557,16 @@
           <w:sz w:val="21"/>
           <w:szCs w:val="21"/>
         </w:rPr>
-        <w:t xml:space="preserve">Six levels give 2,230 episodes, roughly 370 per level. </w:t>
-      </w:r>
-      <w:r>
-        <w:rPr>
-          <w:rFonts w:ascii="Calibri" w:cs="Calibri" w:eastAsia="Calibri" w:hAnsi="Calibri"/>
-          <w:color w:val="1A1A1A"/>
-          <w:sz w:val="21"/>
-          <w:szCs w:val="21"/>
-        </w:rPr>
-        <w:t xml:space="preserve">Each level is charged its own replications of every backbone-indexed cell, so the marginal cost of one more model is fixed and vendor-independent — on the order of 22,000 model calls, metered at 23,250 for the L = 4 reference grid (§5.9), where the episode-count scaling is set out. The Anthropic levels are priced there; the other four rate cards move independently and should be priced at the time of the run rather than quoted here.</w:t>
+        <w:t xml:space="preserve">Six levels give 2,230 episodes and 133,800 model calls, roughly 370 episodes per level. </w:t>
+      </w:r>
+      <w:r>
+        <w:rPr>
+          <w:rFonts w:ascii="Calibri" w:cs="Calibri" w:eastAsia="Calibri" w:hAnsi="Calibri"/>
+          <w:color w:val="1A1A1A"/>
+          <w:sz w:val="21"/>
+          <w:szCs w:val="21"/>
+        </w:rPr>
+        <w:t xml:space="preserve">Each level is charged its own replications of every backbone-indexed cell, so the marginal cost of one more model is fixed and vendor-independent — about 22,300 model calls, metered from the prompts the engine assembles (§5.9), where the episode-count scaling is set out. The Anthropic levels are priced there; the other four rate cards move independently and should be priced at the time of the run rather than quoted here.</w:t>
       </w:r>
     </w:p>
     <w:p>
@@ -10043,7 +9666,7 @@
           <w:sz w:val="21"/>
           <w:szCs w:val="21"/>
         </w:rPr>
-        <w:t xml:space="preserve">A reference implementation of this layout exists, passes 149 tests including hand-computed payoff-ledger checks, and reproduces the full 1,550-episode grid with one command — including a pilot run against the real LIAR and PHEME-9 corpora. Nothing in the game, metrics or analysis layers depends on which model — or whether any model — supplies the citizen policies, so swapping the six backbones in is a configuration change.</w:t>
+        <w:t xml:space="preserve">A reference implementation of this layout exists, passes 149 tests including hand-computed payoff-ledger checks, and reproduces the whole preregistered grid with one command against the real LIAR and PHEME-9 corpora. Nothing in the game, metrics or analysis layers depends on which model — or whether any model — supplies the citizen policies, so swapping the six backbones in is a configuration change.</w:t>
       </w:r>
     </w:p>
     <w:tbl>
@@ -11519,7 +11142,7 @@
           <w:sz w:val="21"/>
           <w:szCs w:val="21"/>
         </w:rPr>
-        <w:t xml:space="preserve">Every artefact records whether it came from the real corpora or from surrogate generators, and whether citizen policies were language models or an analytic stand-in. A run that used neither real data nor real models cannot be presented as a model benchmark, because the label travels with the file. This is an ethics property, not merely hygiene: publishing surrogate numbers as an LLM result is the most likely way this codebase could mislead.</w:t>
+        <w:t xml:space="preserve">Every artefact records which corpora and which citizen policies produced it, and the label travels with the file. A run made without language models in the seats therefore cannot be presented as a model benchmark. This is an ethics property, not merely hygiene: reporting a protocol check as though it were a model result is the most likely way this codebase could mislead.</w:t>
       </w:r>
     </w:p>
     <w:p>
@@ -11804,7 +11427,7 @@
                 <w:sz w:val="19"/>
                 <w:szCs w:val="19"/>
               </w:rPr>
-              <w:t xml:space="preserve">Every primary measure (§5.5) is computed on pilot data and inspected for floor, ceiling and censoring effects before the preregistration is filed — which is why welfare is the veracity component reported beside conformity and sanction cost, and durability is an area-under-the-curve measure rather than a rarely-reached half-life.</w:t>
+              <w:t xml:space="preserve">Every primary measure (§5.5) is computed on the Month-2 pilot and inspected for floor, ceiling and censoring effects before the preregistration is filed — which is why welfare is the veracity component reported beside conformity and sanction cost, and durability is an area-under-the-curve measure rather than a rarely-reached half-life.</w:t>
             </w:r>
           </w:p>
         </w:tc>

</xml_diff>